<commit_message>
chore: publish full latest working code to main (via GitHub API)
Consolidates the local main history (26 commits, tip ceba9606ff5a) into a single commit whose tree is identical to local HEAD. Published through the REST API because native git push and SSH are blocked by the corporate network.

Includes: margin CSR gate moved to the Kohler-type shower product, order-confirmation card enrichment, audit-trail redesign, radio-button CSR selections, and docs/CSR-Approval-Processes.md.
</commit_message>
<xml_diff>
--- a/docs/Demo_Start_Guide.docx
+++ b/docs/Demo_Start_Guide.docx
@@ -197,7 +197,7 @@
         <w:t xml:space="preserve">B) Upload Excel:  </w:t>
       </w:r>
       <w:r>
-        <w:t>Click the + (plus) button near the chat box, then choose a PO Excel (.xlsx) file. Only Excel files are accepted.</w:t>
+        <w:t>Click the + (plus) button near the chat box, then choose a PO Excel (.xlsx) file. Only Excel files are accepted. Ready-to-use Excel copies of the two demo POs live at demo/Happy-Flow-PO.xlsx and demo/CSR-Approval-PO.xlsx.</w:t>
       </w:r>
     </w:p>
     <w:p>
@@ -239,7 +239,7 @@
         <w:pStyle w:val="ListBullet"/>
       </w:pPr>
       <w:r>
-        <w:t>For approvals or pricing problems, it shows a sample email being sent to the right manager. No real email is sent — it is only for show.</w:t>
+        <w:t>For approvals or pricing problems, it shows the email being sent to the right manager, and the process pauses until that manager responds.</w:t>
       </w:r>
     </w:p>
     <w:p>
@@ -257,12 +257,12 @@
           <w:color w:val="2563EB"/>
           <w:sz w:val="28"/>
         </w:rPr>
-        <w:t>Suggested demo flow (a good story to tell)</w:t>
+        <w:t>Suggested demo flow (only TWO PO files)</w:t>
       </w:r>
     </w:p>
     <w:p>
       <w:r>
-        <w:t>Run these in order for the smoothest demo:</w:t>
+        <w:t>The whole demo now uses just two purchase-order files. Run them in this order:</w:t>
       </w:r>
     </w:p>
     <w:p>
@@ -276,7 +276,7 @@
         <w:rPr>
           <w:i/>
         </w:rPr>
-        <w:t>(sample-data/US-01/sample-po-comprehensive.txt)</w:t>
+        <w:t>(demo/Happy-Flow-PO.txt  (or .xlsx))</w:t>
       </w:r>
     </w:p>
     <w:p>
@@ -284,7 +284,7 @@
         <w:pStyle w:val="ListBullet"/>
       </w:pPr>
       <w:r>
-        <w:t>Show a complete PO sailing through all 12 checks and creating an order.</w:t>
+        <w:t>A clean order that contains only the mandatory fields. Show the agent reading it, resolving the customer and buyer from the company name and email, and running every check straight through to a created order with no human input needed. Every optional header field (contact person, contract reference, delivery instructions) is backfilled from master data — the PO card marks these with a small 'from master data' badge. During pricing the agent internally calculates BOTH the freight / shipping charge and the state sales tax and displays them in the 'Order totals' block.</w:t>
       </w:r>
     </w:p>
     <w:p>
@@ -292,13 +292,13 @@
         <w:rPr>
           <w:b/>
         </w:rPr>
-        <w:t xml:space="preserve">2. Missing information  </w:t>
+        <w:t xml:space="preserve">2. The interactive CSR-approval PO  </w:t>
       </w:r>
       <w:r>
         <w:rPr>
           <w:i/>
         </w:rPr>
-        <w:t>(sample-data/US-01/sample-po-missing-fields.xlsx)</w:t>
+        <w:t>(demo/CSR-Approval-PO.txt  (or .xlsx))</w:t>
       </w:r>
     </w:p>
     <w:p>
@@ -306,139 +306,12 @@
         <w:pStyle w:val="ListBullet"/>
       </w:pPr>
       <w:r>
-        <w:t>Show the agent catching missing fields and asking for them.</w:t>
+        <w:t>One order that deliberately contains problems, so you can show the agent thinking and asking the CSR to decide at every human-in-the-loop gate. In sequence it will: (a) ask which registered buyer to use when the email is unknown; (b) recommend a substitute for a discontinued product and ask for approval; (c) identify a product from its description when the customer used their own code; (d) identify a product when the SKU is missing entirely; (e) ask for a quantity when a line has zero; (f) convert a non-standard unit of measure (cases to each) and show the maths; (g) confirm a partial ship-to (a location name only) against the address book; then the decision-layer gates — (h) a Pricing &amp; Promo discount exception, (i) a Credit hold, (j) an Inventory shortage, and (k) an unserviceable delivery ZIP. For each one the CSR can Approve, Reject, or Escalate — or type a correction. Approve each in turn and the order completes.</w:t>
       </w:r>
     </w:p>
     <w:p>
       <w:r>
-        <w:rPr>
-          <w:b/>
-        </w:rPr>
-        <w:t xml:space="preserve">3. Wrong ship-to  </w:t>
-      </w:r>
-      <w:r>
-        <w:rPr>
-          <w:i/>
-        </w:rPr>
-        <w:t>(sample-data/US-02/scenario-invalid-shipto.txt)</w:t>
-      </w:r>
-    </w:p>
-    <w:p>
-      <w:pPr>
-        <w:pStyle w:val="ListBullet"/>
-      </w:pPr>
-      <w:r>
-        <w:t>Show the agent confirming the delivery address belongs to the customer.</w:t>
-      </w:r>
-    </w:p>
-    <w:p>
-      <w:r>
-        <w:rPr>
-          <w:b/>
-        </w:rPr>
-        <w:t xml:space="preserve">4. Pricing build-up  </w:t>
-      </w:r>
-      <w:r>
-        <w:rPr>
-          <w:i/>
-        </w:rPr>
-        <w:t>(sample-data/US-06/happy-path.txt)</w:t>
-      </w:r>
-    </w:p>
-    <w:p>
-      <w:pPr>
-        <w:pStyle w:val="ListBullet"/>
-      </w:pPr>
-      <w:r>
-        <w:t>Show the price waterfall — how the final price is built step by step.</w:t>
-      </w:r>
-    </w:p>
-    <w:p>
-      <w:r>
-        <w:rPr>
-          <w:b/>
-        </w:rPr>
-        <w:t xml:space="preserve">5. Needs approval  </w:t>
-      </w:r>
-      <w:r>
-        <w:rPr>
-          <w:i/>
-        </w:rPr>
-        <w:t>(sample-data/US-07/scenario-approval-required.txt)</w:t>
-      </w:r>
-    </w:p>
-    <w:p>
-      <w:pPr>
-        <w:pStyle w:val="ListBullet"/>
-      </w:pPr>
-      <w:r>
-        <w:t>Show the agent routing a big order to a manager (sample email).</w:t>
-      </w:r>
-    </w:p>
-    <w:p>
-      <w:r>
-        <w:rPr>
-          <w:b/>
-        </w:rPr>
-        <w:t xml:space="preserve">6. Credit hold  </w:t>
-      </w:r>
-      <w:r>
-        <w:rPr>
-          <w:i/>
-        </w:rPr>
-        <w:t>(sample-data/US-08/scenario-credit-hold.txt)</w:t>
-      </w:r>
-    </w:p>
-    <w:p>
-      <w:pPr>
-        <w:pStyle w:val="ListBullet"/>
-      </w:pPr>
-      <w:r>
-        <w:t>Show the agent stopping an order that is over the credit limit.</w:t>
-      </w:r>
-    </w:p>
-    <w:p>
-      <w:r>
-        <w:rPr>
-          <w:b/>
-        </w:rPr>
-        <w:t xml:space="preserve">7. Out of stock  </w:t>
-      </w:r>
-      <w:r>
-        <w:rPr>
-          <w:i/>
-        </w:rPr>
-        <w:t>(sample-data/US-09/scenario-inventory-shortage.txt)</w:t>
-      </w:r>
-    </w:p>
-    <w:p>
-      <w:pPr>
-        <w:pStyle w:val="ListBullet"/>
-      </w:pPr>
-      <w:r>
-        <w:t>Show the agent spotting not enough stock.</w:t>
-      </w:r>
-    </w:p>
-    <w:p>
-      <w:r>
-        <w:rPr>
-          <w:b/>
-        </w:rPr>
-        <w:t xml:space="preserve">8. Order created  </w:t>
-      </w:r>
-      <w:r>
-        <w:rPr>
-          <w:i/>
-        </w:rPr>
-        <w:t>(sample-data/US-12/happy-path.txt)</w:t>
-      </w:r>
-    </w:p>
-    <w:p>
-      <w:pPr>
-        <w:pStyle w:val="ListBullet"/>
-      </w:pPr>
-      <w:r>
-        <w:t>Finish by showing the order being created in the downstream systems.</w:t>
+        <w:t>Tip: the agent works deliberately at a steady pace and shows what it is checking internally (like an assistant thinking) so the audience can follow each decision.</w:t>
       </w:r>
     </w:p>
     <w:p>
@@ -446,7 +319,7 @@
         <w:pStyle w:val="IntenseQuote"/>
       </w:pPr>
       <w:r>
-        <w:t>For the full list of every test and its expected result, see the Excel file 'Unit_Test_Plan_US01-US12.xlsx' in the docs folder.</w:t>
+        <w:t>For the full list of every test and its expected result, see the Excel file 'Unit_Test_Plan_Interactive_Demo.xlsx' in the docs folder.</w:t>
       </w:r>
     </w:p>
     <w:p>

</xml_diff>